<commit_message>
Harden motion UX and plugin gates
</commit_message>
<xml_diff>
--- a/Template/Klant-Website Discovery -Vragenlijst.docx
+++ b/Template/Klant-Website Discovery -Vragenlijst.docx
@@ -156,10 +156,22 @@
               </w:rPr>
               <w:t xml:space="preserve"> precies, en voor wie? (Leg het in één of twee zinnen uit, alsof we elkaar net ontmoeten).</w:t>
             </w:r>
+            <w:r>
+              <w:rPr>
+                <w:rFonts w:ascii="Arial" w:hAnsi="Arial"/>
+                <w:color w:val="333333"/>
+                <w:sz w:val="21"/>
+                <w:lang w:val="nl-NL"/>
+              </w:rPr>
+              <w:t xml:space="preserve"> Geeft ook aan wat de naam van u organisatie is.</w:t>
+            </w:r>
           </w:p>
           <w:p>
             <w:pPr>
               <w:spacing w:before="240" w:after="480"/>
+              <w:rPr>
+                <w:lang w:val="nl-NL"/>
+              </w:rPr>
             </w:pPr>
             <w:r>
               <w:rPr>
@@ -167,6 +179,7 @@
                 <w:i/>
                 <w:color w:val="708090"/>
                 <w:sz w:val="20"/>
+                <w:lang w:val="nl-NL"/>
               </w:rPr>
               <w:t>[Uw antwoord hier...]</w:t>
             </w:r>
@@ -177,6 +190,9 @@
     <w:p>
       <w:pPr>
         <w:spacing w:after="120"/>
+        <w:rPr>
+          <w:lang w:val="nl-NL"/>
+        </w:rPr>
       </w:pPr>
     </w:p>
     <w:tbl>

</xml_diff>